<commit_message>
feat: standardize asset-scoped UMG handoff docs
</commit_message>
<xml_diff>
--- a/plugins/nextgame-ui/skills/artifact-template-nextgame-umg/assets/reference.docx
+++ b/plugins/nextgame-ui/skills/artifact-template-nextgame-umg/assets/reference.docx
@@ -134,7 +134,7 @@
                 <w:color w:val="202833"/>
                 <w:sz w:val="20"/>
               </w:rPr>
-              <w:t>范围说明：本文档只列出程序需要读写、填充或控制的 Widget、动态集合、EntryClass 关系与高层状态意图；布局、字号、颜色、固定文案、底板与装饰等静态配置不重复记录。</w:t>
+              <w:t>程序范围：[ScopeStatement]</w:t>
             </w:r>
           </w:p>
         </w:tc>
@@ -147,30 +147,10 @@
     </w:p>
     <w:p>
       <w:pPr>
-        <w:spacing w:after="200"/>
-      </w:pPr>
-      <w:r>
-        <w:rPr>
-          <w:rFonts w:ascii="Arial" w:hAnsi="Arial" w:eastAsia="黑体"/>
-          <w:b/>
-          <w:sz w:val="21"/>
-        </w:rPr>
-        <w:t>生成依据：</w:t>
-      </w:r>
-      <w:r>
-        <w:rPr>
-          <w:rFonts w:ascii="Arial" w:hAnsi="Arial" w:eastAsia="宋体"/>
-          <w:sz w:val="21"/>
-        </w:rPr>
-        <w:t>已确认 UIRequirementSpec → 已完成并验收的 UIBuildBundle → Unreal 保存后 WidgetTree 实际读回 → UIProgramHandoff。控件树图仅用于定位；本文档不表示程序逻辑已经完成。</w:t>
-      </w:r>
-    </w:p>
-    <w:p>
-      <w:pPr>
         <w:pStyle w:val="ToolSection"/>
       </w:pPr>
       <w:r>
-        <w:t>1. 目标资产</w:t>
+        <w:t>1. 资产详细说明</w:t>
       </w:r>
     </w:p>
     <w:p>
@@ -179,13 +159,111 @@
         <w:keepNext/>
       </w:pPr>
       <w:r>
-        <w:t>将下表占位行按目标资产数量克隆；不要保留方括号占位符。</w:t>
+        <w:t>将本资产块按目标资产数量完整克隆；主界面优先，随后按依赖顺序排列子控件与条目。</w:t>
+      </w:r>
+    </w:p>
+    <w:p>
+      <w:pPr>
+        <w:spacing w:after="160"/>
+        <w:jc w:val="left"/>
+      </w:pPr>
+      <w:r>
+        <w:t>以下内容按资产给出实际 WidgetTree 与程序用途合并表，再说明程序接入关系。</w:t>
+      </w:r>
+    </w:p>
+    <w:p>
+      <w:pPr>
+        <w:pStyle w:val="Heading2"/>
+      </w:pPr>
+      <w:r>
+        <w:t>[AssetName][ChineseFunctionalName]</w:t>
+      </w:r>
+    </w:p>
+    <w:p>
+      <w:pPr>
+        <w:spacing w:after="80"/>
+        <w:jc w:val="left"/>
+      </w:pPr>
+      <w:r>
+        <w:rPr>
+          <w:rFonts w:ascii="Arial" w:hAnsi="Arial" w:eastAsia="黑体"/>
+          <w:b/>
+          <w:sz w:val="21"/>
+        </w:rPr>
+        <w:t>资产路径：</w:t>
+      </w:r>
+      <w:r>
+        <w:rPr>
+          <w:rFonts w:ascii="Arial" w:hAnsi="Arial" w:eastAsia="宋体"/>
+          <w:sz w:val="21"/>
+        </w:rPr>
+        <w:t>[TargetAssetPath]</w:t>
+      </w:r>
+    </w:p>
+    <w:p>
+      <w:pPr>
+        <w:spacing w:after="80"/>
+        <w:jc w:val="left"/>
+      </w:pPr>
+      <w:r>
+        <w:rPr>
+          <w:rFonts w:ascii="Arial" w:hAnsi="Arial" w:eastAsia="黑体"/>
+          <w:b/>
+          <w:sz w:val="21"/>
+        </w:rPr>
+        <w:t>Parent Class：</w:t>
+      </w:r>
+      <w:r>
+        <w:rPr>
+          <w:rFonts w:ascii="Arial" w:hAnsi="Arial" w:eastAsia="宋体"/>
+          <w:sz w:val="21"/>
+        </w:rPr>
+        <w:t>[ParentClass]</w:t>
+      </w:r>
+    </w:p>
+    <w:p>
+      <w:pPr>
+        <w:spacing w:after="120"/>
+        <w:jc w:val="left"/>
+      </w:pPr>
+      <w:r>
+        <w:rPr>
+          <w:rFonts w:ascii="Arial" w:hAnsi="Arial" w:eastAsia="黑体"/>
+          <w:b/>
+          <w:sz w:val="21"/>
+        </w:rPr>
+        <w:t>功能说明：</w:t>
+      </w:r>
+      <w:r>
+        <w:rPr>
+          <w:rFonts w:ascii="Arial" w:hAnsi="Arial" w:eastAsia="宋体"/>
+          <w:sz w:val="21"/>
+        </w:rPr>
+        <w:t>[FunctionalSummary]</w:t>
+      </w:r>
+    </w:p>
+    <w:p>
+      <w:pPr>
+        <w:pStyle w:val="TemplateNote"/>
+        <w:keepNext/>
+      </w:pPr>
+      <w:r>
+        <w:t>按结构化行逐节点克隆；首列用 depth × indentTwipsPerDepth 设置 Word 左缩进，第三列只写小写 true/false，第四列写同资产程序用途或留空；reuse-only 空树改用固定跨四列说明行。</w:t>
+      </w:r>
+    </w:p>
+    <w:p>
+      <w:pPr>
+        <w:pStyle w:val="TreeCaption"/>
+        <w:keepNext/>
+      </w:pPr>
+      <w:r>
+        <w:t>[AssetName][ChineseFunctionalName] · Unreal 保存后实际 WidgetTree</w:t>
       </w:r>
     </w:p>
     <w:tbl>
       <w:tblPr>
         <w:tblStyle w:val="TableGrid"/>
-        <w:tblW w:type="auto" w:w="0"/>
+        <w:tblW w:type="dxa" w:w="8278"/>
         <w:jc w:val="center"/>
         <w:tblLayout w:type="fixed"/>
         <w:tblLook w:firstColumn="1" w:firstRow="1" w:lastColumn="0" w:lastRow="0" w:noHBand="0" w:noVBand="1" w:val="04A0"/>
@@ -199,8 +277,10 @@
         </w:tblBorders>
       </w:tblPr>
       <w:tblGrid>
-        <w:gridCol w:w="4153"/>
-        <w:gridCol w:w="4153"/>
+        <w:gridCol w:w="2948"/>
+        <w:gridCol w:w="1928"/>
+        <w:gridCol w:w="1134"/>
+        <w:gridCol w:w="2268"/>
       </w:tblGrid>
       <w:tr>
         <w:trPr>
@@ -209,7 +289,7 @@
         </w:trPr>
         <w:tc>
           <w:tcPr>
-            <w:tcW w:type="dxa" w:w="2381"/>
+            <w:tcW w:type="dxa" w:w="2948"/>
             <w:shd w:fill="E7EFF8"/>
             <w:vAlign w:val="center"/>
             <w:tcMar>
@@ -232,13 +312,13 @@
                 <w:color w:val="1F4E79"/>
                 <w:sz w:val="18"/>
               </w:rPr>
-              <w:t>资产角色</w:t>
+              <w:t>层级 / Widget</w:t>
             </w:r>
           </w:p>
         </w:tc>
         <w:tc>
           <w:tcPr>
-            <w:tcW w:type="dxa" w:w="5896"/>
+            <w:tcW w:type="dxa" w:w="1928"/>
             <w:shd w:fill="E7EFF8"/>
             <w:vAlign w:val="center"/>
             <w:tcMar>
@@ -261,7 +341,65 @@
                 <w:color w:val="1F4E79"/>
                 <w:sz w:val="18"/>
               </w:rPr>
-              <w:t>资产路径</w:t>
+              <w:t>Class</w:t>
+            </w:r>
+          </w:p>
+        </w:tc>
+        <w:tc>
+          <w:tcPr>
+            <w:tcW w:type="dxa" w:w="1134"/>
+            <w:shd w:fill="E7EFF8"/>
+            <w:vAlign w:val="center"/>
+            <w:tcMar>
+              <w:top w:w="100" w:type="dxa"/>
+              <w:start w:w="120" w:type="dxa"/>
+              <w:bottom w:w="100" w:type="dxa"/>
+              <w:end w:w="120" w:type="dxa"/>
+            </w:tcMar>
+          </w:tcPr>
+          <w:p>
+            <w:pPr>
+              <w:spacing w:after="0" w:before="0"/>
+              <w:jc w:val="center"/>
+            </w:pPr>
+            <w:r/>
+            <w:r>
+              <w:rPr>
+                <w:rFonts w:ascii="Arial" w:hAnsi="Arial" w:eastAsia="等线"/>
+                <w:b/>
+                <w:color w:val="1F4E79"/>
+                <w:sz w:val="18"/>
+              </w:rPr>
+              <w:t>Is Variable</w:t>
+            </w:r>
+          </w:p>
+        </w:tc>
+        <w:tc>
+          <w:tcPr>
+            <w:tcW w:type="dxa" w:w="2268"/>
+            <w:shd w:fill="E7EFF8"/>
+            <w:vAlign w:val="center"/>
+            <w:tcMar>
+              <w:top w:w="100" w:type="dxa"/>
+              <w:start w:w="120" w:type="dxa"/>
+              <w:bottom w:w="100" w:type="dxa"/>
+              <w:end w:w="120" w:type="dxa"/>
+            </w:tcMar>
+          </w:tcPr>
+          <w:p>
+            <w:pPr>
+              <w:spacing w:after="0" w:before="0"/>
+              <w:jc w:val="left"/>
+            </w:pPr>
+            <w:r/>
+            <w:r>
+              <w:rPr>
+                <w:rFonts w:ascii="Arial" w:hAnsi="Arial" w:eastAsia="等线"/>
+                <w:b/>
+                <w:color w:val="1F4E79"/>
+                <w:sz w:val="18"/>
+              </w:rPr>
+              <w:t>程序用途</w:t>
             </w:r>
           </w:p>
         </w:tc>
@@ -272,7 +410,36 @@
         </w:trPr>
         <w:tc>
           <w:tcPr>
-            <w:tcW w:type="dxa" w:w="2381"/>
+            <w:tcW w:type="dxa" w:w="2948"/>
+            <w:vAlign w:val="center"/>
+            <w:tcMar>
+              <w:top w:w="100" w:type="dxa"/>
+              <w:start w:w="120" w:type="dxa"/>
+              <w:bottom w:w="100" w:type="dxa"/>
+              <w:end w:w="120" w:type="dxa"/>
+            </w:tcMar>
+          </w:tcPr>
+          <w:p>
+            <w:pPr>
+              <w:spacing w:after="0" w:before="0"/>
+              <w:ind w:left="180"/>
+              <w:jc w:val="left"/>
+            </w:pPr>
+            <w:r/>
+            <w:r>
+              <w:rPr>
+                <w:rFonts w:ascii="Arial" w:hAnsi="Arial" w:eastAsia="等线"/>
+                <w:b w:val="0"/>
+                <w:color w:val="5F6B7A"/>
+                <w:sz w:val="17"/>
+              </w:rPr>
+              <w:t>[WidgetName]</w:t>
+            </w:r>
+          </w:p>
+        </w:tc>
+        <w:tc>
+          <w:tcPr>
+            <w:tcW w:type="dxa" w:w="1928"/>
             <w:vAlign w:val="center"/>
             <w:tcMar>
               <w:top w:w="100" w:type="dxa"/>
@@ -292,15 +459,43 @@
                 <w:rFonts w:ascii="Arial" w:hAnsi="Arial" w:eastAsia="等线"/>
                 <w:b w:val="0"/>
                 <w:color w:val="5F6B7A"/>
-                <w:sz w:val="16"/>
+                <w:sz w:val="17"/>
               </w:rPr>
-              <w:t>[AssetRole]</w:t>
+              <w:t>[WidgetClass]</w:t>
             </w:r>
           </w:p>
         </w:tc>
         <w:tc>
           <w:tcPr>
-            <w:tcW w:type="dxa" w:w="5896"/>
+            <w:tcW w:type="dxa" w:w="1134"/>
+            <w:vAlign w:val="center"/>
+            <w:tcMar>
+              <w:top w:w="100" w:type="dxa"/>
+              <w:start w:w="120" w:type="dxa"/>
+              <w:bottom w:w="100" w:type="dxa"/>
+              <w:end w:w="120" w:type="dxa"/>
+            </w:tcMar>
+          </w:tcPr>
+          <w:p>
+            <w:pPr>
+              <w:spacing w:after="0" w:before="0"/>
+              <w:jc w:val="center"/>
+            </w:pPr>
+            <w:r/>
+            <w:r>
+              <w:rPr>
+                <w:rFonts w:ascii="Arial" w:hAnsi="Arial" w:eastAsia="等线"/>
+                <w:b w:val="0"/>
+                <w:color w:val="5F6B7A"/>
+                <w:sz w:val="17"/>
+              </w:rPr>
+              <w:t>[IsVariable]</w:t>
+            </w:r>
+          </w:p>
+        </w:tc>
+        <w:tc>
+          <w:tcPr>
+            <w:tcW w:type="dxa" w:w="2268"/>
             <w:vAlign w:val="center"/>
             <w:tcMar>
               <w:top w:w="100" w:type="dxa"/>
@@ -320,9 +515,9 @@
                 <w:rFonts w:ascii="Arial" w:hAnsi="Arial" w:eastAsia="等线"/>
                 <w:b w:val="0"/>
                 <w:color w:val="5F6B7A"/>
-                <w:sz w:val="16"/>
+                <w:sz w:val="17"/>
               </w:rPr>
-              <w:t>[TargetAssetPath]</w:t>
+              <w:t>[ProgramPurposeOrBlank]</w:t>
             </w:r>
           </w:p>
         </w:tc>
@@ -332,146 +527,6 @@
       <w:pPr>
         <w:spacing w:after="0"/>
       </w:pPr>
-    </w:p>
-    <w:p>
-      <w:r>
-        <w:br w:type="page"/>
-      </w:r>
-    </w:p>
-    <w:p>
-      <w:pPr>
-        <w:pStyle w:val="ToolSection"/>
-      </w:pPr>
-      <w:r>
-        <w:t>2. 资产详细说明</w:t>
-      </w:r>
-    </w:p>
-    <w:p>
-      <w:pPr>
-        <w:pStyle w:val="TemplateNote"/>
-        <w:keepNext/>
-      </w:pPr>
-      <w:r>
-        <w:t>将本资产块按目标资产数量完整克隆；主界面优先，随后按依赖顺序排列子控件与条目。</w:t>
-      </w:r>
-    </w:p>
-    <w:p>
-      <w:pPr>
-        <w:spacing w:after="160"/>
-        <w:jc w:val="left"/>
-      </w:pPr>
-      <w:r>
-        <w:t>以下内容按资产给出实际控件树，再说明程序接入关系和需要控制的 Widget。</w:t>
-      </w:r>
-    </w:p>
-    <w:p>
-      <w:pPr>
-        <w:pStyle w:val="Heading2"/>
-      </w:pPr>
-      <w:r>
-        <w:t>[AssetDisplayName]</w:t>
-      </w:r>
-    </w:p>
-    <w:tbl>
-      <w:tblPr>
-        <w:tblW w:type="auto" w:w="0"/>
-        <w:jc w:val="center"/>
-        <w:tblLayout w:type="fixed"/>
-        <w:tblLook w:firstColumn="1" w:firstRow="1" w:lastColumn="0" w:lastRow="0" w:noHBand="0" w:noVBand="1" w:val="04A0"/>
-      </w:tblPr>
-      <w:tblGrid>
-        <w:gridCol w:w="8306"/>
-      </w:tblGrid>
-      <w:tr>
-        <w:trPr>
-          <w:cantSplit/>
-        </w:trPr>
-        <w:tc>
-          <w:tcPr>
-            <w:tcW w:type="dxa" w:w="8306"/>
-            <w:shd w:fill="F1F4F8"/>
-            <w:tcMar>
-              <w:top w:w="140" w:type="dxa"/>
-              <w:start w:w="160" w:type="dxa"/>
-              <w:bottom w:w="140" w:type="dxa"/>
-              <w:end w:w="160" w:type="dxa"/>
-            </w:tcMar>
-          </w:tcPr>
-          <w:p>
-            <w:pPr>
-              <w:keepLines/>
-              <w:spacing w:after="0"/>
-              <w:jc w:val="left"/>
-            </w:pPr>
-            <w:r/>
-            <w:r>
-              <w:rPr>
-                <w:rFonts w:ascii="Consolas" w:hAnsi="Consolas" w:eastAsia="等线"/>
-                <w:color w:val="5F6B7A"/>
-                <w:sz w:val="16"/>
-              </w:rPr>
-              <w:t>[WidgetTreeRoot]</w:t>
-            </w:r>
-            <w:r>
-              <w:br/>
-            </w:r>
-            <w:r>
-              <w:rPr>
-                <w:rFonts w:ascii="Consolas" w:hAnsi="Consolas" w:eastAsia="等线"/>
-                <w:color w:val="5F6B7A"/>
-                <w:sz w:val="16"/>
-              </w:rPr>
-              <w:t>├─ [WidgetTreeNode]</w:t>
-            </w:r>
-            <w:r>
-              <w:br/>
-            </w:r>
-            <w:r>
-              <w:rPr>
-                <w:rFonts w:ascii="Consolas" w:hAnsi="Consolas" w:eastAsia="等线"/>
-                <w:color w:val="5F6B7A"/>
-                <w:sz w:val="16"/>
-              </w:rPr>
-              <w:t>└─ [WidgetTreeNode]</w:t>
-            </w:r>
-          </w:p>
-        </w:tc>
-      </w:tr>
-    </w:tbl>
-    <w:p>
-      <w:pPr>
-        <w:spacing w:after="0"/>
-      </w:pPr>
-    </w:p>
-    <w:p>
-      <w:pPr>
-        <w:pStyle w:val="TreeCaption"/>
-        <w:keepNext/>
-      </w:pPr>
-      <w:r>
-        <w:t>[AssetDisplayName] · Unreal 保存后实际 WidgetTree</w:t>
-      </w:r>
-    </w:p>
-    <w:p>
-      <w:pPr>
-        <w:spacing w:after="80"/>
-        <w:jc w:val="left"/>
-      </w:pPr>
-      <w:r>
-        <w:rPr>
-          <w:rFonts w:ascii="Arial" w:hAnsi="Arial" w:eastAsia="黑体"/>
-          <w:b/>
-          <w:sz w:val="21"/>
-        </w:rPr>
-        <w:t>资产路径：</w:t>
-      </w:r>
-      <w:r>
-        <w:rPr>
-          <w:rFonts w:ascii="Arial" w:hAnsi="Arial" w:eastAsia="宋体"/>
-          <w:sz w:val="21"/>
-        </w:rPr>
-        <w:t>[TargetAssetPath]</w:t>
-      </w:r>
     </w:p>
     <w:p>
       <w:pPr>
@@ -516,259 +571,34 @@
       </w:r>
     </w:p>
     <w:p>
-      <w:r>
-        <w:br w:type="page"/>
-      </w:r>
-    </w:p>
-    <w:p>
-      <w:pPr>
-        <w:pStyle w:val="ToolSection"/>
-      </w:pPr>
-      <w:r>
-        <w:t>3. 程序变量清单</w:t>
-      </w:r>
-    </w:p>
-    <w:p>
       <w:pPr>
         <w:pStyle w:val="TemplateNote"/>
         <w:keepNext/>
       </w:pPr>
       <w:r>
-        <w:t>条件区块：没有程序变量时省略本节。按实际变量数量克隆数据行。</w:t>
+        <w:t>条件区块：仅在本资产拥有动态集合时保留；只克隆归属于本资产的集合，每个集合独立一行并明确容器与 EntryClass 关系。</w:t>
       </w:r>
     </w:p>
     <w:p>
       <w:pPr>
-        <w:pStyle w:val="ToolAsset"/>
+        <w:keepNext/>
+        <w:spacing w:after="80"/>
+        <w:jc w:val="left"/>
       </w:pPr>
       <w:r>
-        <w:t>[TargetAssetPath]</w:t>
+        <w:rPr>
+          <w:rFonts w:ascii="Arial" w:hAnsi="Arial" w:eastAsia="黑体"/>
+          <w:b/>
+          <w:sz w:val="21"/>
+        </w:rPr>
+        <w:t>动态集合：</w:t>
       </w:r>
-    </w:p>
-    <w:tbl>
-      <w:tblPr>
-        <w:tblStyle w:val="TableGrid"/>
-        <w:tblW w:type="auto" w:w="0"/>
-        <w:jc w:val="center"/>
-        <w:tblLayout w:type="fixed"/>
-        <w:tblLook w:firstColumn="1" w:firstRow="1" w:lastColumn="0" w:lastRow="0" w:noHBand="0" w:noVBand="1" w:val="04A0"/>
-        <w:tblBorders>
-          <w:top w:val="single" w:sz="5" w:color="BCCBDA"/>
-          <w:left w:val="single" w:sz="5" w:color="BCCBDA"/>
-          <w:bottom w:val="single" w:sz="5" w:color="BCCBDA"/>
-          <w:right w:val="single" w:sz="5" w:color="BCCBDA"/>
-          <w:insideH w:val="single" w:sz="5" w:color="BCCBDA"/>
-          <w:insideV w:val="single" w:sz="5" w:color="BCCBDA"/>
-        </w:tblBorders>
-      </w:tblPr>
-      <w:tblGrid>
-        <w:gridCol w:w="2769"/>
-        <w:gridCol w:w="2769"/>
-        <w:gridCol w:w="2769"/>
-      </w:tblGrid>
-      <w:tr>
-        <w:trPr>
-          <w:tblHeader w:val="true"/>
-          <w:cantSplit/>
-        </w:trPr>
-        <w:tc>
-          <w:tcPr>
-            <w:tcW w:type="dxa" w:w="3288"/>
-            <w:shd w:fill="E7EFF8"/>
-            <w:vAlign w:val="center"/>
-            <w:tcMar>
-              <w:top w:w="100" w:type="dxa"/>
-              <w:start w:w="120" w:type="dxa"/>
-              <w:bottom w:w="100" w:type="dxa"/>
-              <w:end w:w="120" w:type="dxa"/>
-            </w:tcMar>
-          </w:tcPr>
-          <w:p>
-            <w:pPr>
-              <w:spacing w:after="0" w:before="0"/>
-              <w:jc w:val="left"/>
-            </w:pPr>
-            <w:r/>
-            <w:r>
-              <w:rPr>
-                <w:rFonts w:ascii="Arial" w:hAnsi="Arial" w:eastAsia="等线"/>
-                <w:b/>
-                <w:color w:val="1F4E79"/>
-                <w:sz w:val="18"/>
-              </w:rPr>
-              <w:t>控件名</w:t>
-            </w:r>
-          </w:p>
-        </w:tc>
-        <w:tc>
-          <w:tcPr>
-            <w:tcW w:type="dxa" w:w="2211"/>
-            <w:shd w:fill="E7EFF8"/>
-            <w:vAlign w:val="center"/>
-            <w:tcMar>
-              <w:top w:w="100" w:type="dxa"/>
-              <w:start w:w="120" w:type="dxa"/>
-              <w:bottom w:w="100" w:type="dxa"/>
-              <w:end w:w="120" w:type="dxa"/>
-            </w:tcMar>
-          </w:tcPr>
-          <w:p>
-            <w:pPr>
-              <w:spacing w:after="0" w:before="0"/>
-              <w:jc w:val="left"/>
-            </w:pPr>
-            <w:r/>
-            <w:r>
-              <w:rPr>
-                <w:rFonts w:ascii="Arial" w:hAnsi="Arial" w:eastAsia="等线"/>
-                <w:b/>
-                <w:color w:val="1F4E79"/>
-                <w:sz w:val="18"/>
-              </w:rPr>
-              <w:t>控件类型</w:t>
-            </w:r>
-          </w:p>
-        </w:tc>
-        <w:tc>
-          <w:tcPr>
-            <w:tcW w:type="dxa" w:w="2778"/>
-            <w:shd w:fill="E7EFF8"/>
-            <w:vAlign w:val="center"/>
-            <w:tcMar>
-              <w:top w:w="100" w:type="dxa"/>
-              <w:start w:w="120" w:type="dxa"/>
-              <w:bottom w:w="100" w:type="dxa"/>
-              <w:end w:w="120" w:type="dxa"/>
-            </w:tcMar>
-          </w:tcPr>
-          <w:p>
-            <w:pPr>
-              <w:spacing w:after="0" w:before="0"/>
-              <w:jc w:val="left"/>
-            </w:pPr>
-            <w:r/>
-            <w:r>
-              <w:rPr>
-                <w:rFonts w:ascii="Arial" w:hAnsi="Arial" w:eastAsia="等线"/>
-                <w:b/>
-                <w:color w:val="1F4E79"/>
-                <w:sz w:val="18"/>
-              </w:rPr>
-              <w:t>程序用途</w:t>
-            </w:r>
-          </w:p>
-        </w:tc>
-      </w:tr>
-      <w:tr>
-        <w:trPr>
-          <w:cantSplit/>
-        </w:trPr>
-        <w:tc>
-          <w:tcPr>
-            <w:tcW w:type="dxa" w:w="3288"/>
-            <w:vAlign w:val="center"/>
-            <w:tcMar>
-              <w:top w:w="100" w:type="dxa"/>
-              <w:start w:w="120" w:type="dxa"/>
-              <w:bottom w:w="100" w:type="dxa"/>
-              <w:end w:w="120" w:type="dxa"/>
-            </w:tcMar>
-          </w:tcPr>
-          <w:p>
-            <w:pPr>
-              <w:spacing w:after="0" w:before="0"/>
-              <w:jc w:val="left"/>
-            </w:pPr>
-            <w:r/>
-            <w:r>
-              <w:rPr>
-                <w:rFonts w:ascii="Arial" w:hAnsi="Arial" w:eastAsia="等线"/>
-                <w:b w:val="0"/>
-                <w:color w:val="5F6B7A"/>
-                <w:sz w:val="16"/>
-              </w:rPr>
-              <w:t>[WidgetName]</w:t>
-            </w:r>
-          </w:p>
-        </w:tc>
-        <w:tc>
-          <w:tcPr>
-            <w:tcW w:type="dxa" w:w="2211"/>
-            <w:vAlign w:val="center"/>
-            <w:tcMar>
-              <w:top w:w="100" w:type="dxa"/>
-              <w:start w:w="120" w:type="dxa"/>
-              <w:bottom w:w="100" w:type="dxa"/>
-              <w:end w:w="120" w:type="dxa"/>
-            </w:tcMar>
-          </w:tcPr>
-          <w:p>
-            <w:pPr>
-              <w:spacing w:after="0" w:before="0"/>
-              <w:jc w:val="left"/>
-            </w:pPr>
-            <w:r/>
-            <w:r>
-              <w:rPr>
-                <w:rFonts w:ascii="Arial" w:hAnsi="Arial" w:eastAsia="等线"/>
-                <w:b w:val="0"/>
-                <w:color w:val="5F6B7A"/>
-                <w:sz w:val="16"/>
-              </w:rPr>
-              <w:t>[WidgetClass]</w:t>
-            </w:r>
-          </w:p>
-        </w:tc>
-        <w:tc>
-          <w:tcPr>
-            <w:tcW w:type="dxa" w:w="2778"/>
-            <w:vAlign w:val="center"/>
-            <w:tcMar>
-              <w:top w:w="100" w:type="dxa"/>
-              <w:start w:w="120" w:type="dxa"/>
-              <w:bottom w:w="100" w:type="dxa"/>
-              <w:end w:w="120" w:type="dxa"/>
-            </w:tcMar>
-          </w:tcPr>
-          <w:p>
-            <w:pPr>
-              <w:spacing w:after="0" w:before="0"/>
-              <w:jc w:val="left"/>
-            </w:pPr>
-            <w:r/>
-            <w:r>
-              <w:rPr>
-                <w:rFonts w:ascii="Arial" w:hAnsi="Arial" w:eastAsia="等线"/>
-                <w:b w:val="0"/>
-                <w:color w:val="5F6B7A"/>
-                <w:sz w:val="16"/>
-              </w:rPr>
-              <w:t>[ProgramPurpose]</w:t>
-            </w:r>
-          </w:p>
-        </w:tc>
-      </w:tr>
-    </w:tbl>
-    <w:p>
-      <w:pPr>
-        <w:spacing w:after="0"/>
-      </w:pPr>
-    </w:p>
-    <w:p>
-      <w:pPr>
-        <w:pStyle w:val="ToolSection"/>
-      </w:pPr>
       <w:r>
-        <w:t>4. 动态集合与 EntryClass</w:t>
-      </w:r>
-    </w:p>
-    <w:p>
-      <w:pPr>
-        <w:pStyle w:val="TemplateNote"/>
-        <w:keepNext/>
-      </w:pPr>
-      <w:r>
-        <w:t>条件区块：没有动态集合时省略本节。每个集合独立一行，明确容器与 EntryClass 关系。</w:t>
+        <w:rPr>
+          <w:rFonts w:ascii="Arial" w:hAnsi="Arial" w:eastAsia="宋体"/>
+          <w:sz w:val="21"/>
+        </w:rPr>
+        <w:t>[CollectionId]</w:t>
       </w:r>
     </w:p>
     <w:tbl>
@@ -1040,19 +870,75 @@
     </w:p>
     <w:p>
       <w:pPr>
-        <w:pStyle w:val="ToolSection"/>
+        <w:pStyle w:val="TemplateNote"/>
+        <w:keepNext/>
       </w:pPr>
       <w:r>
-        <w:t>5. 状态模型</w:t>
+        <w:t>条件区块：仅在本资产拥有已接受且通过实际变量门控的状态模型时保留；只克隆归属于本资产的状态项。</w:t>
       </w:r>
     </w:p>
     <w:p>
       <w:pPr>
-        <w:pStyle w:val="TemplateNote"/>
         <w:keepNext/>
+        <w:spacing w:after="80"/>
+        <w:jc w:val="left"/>
       </w:pPr>
       <w:r>
-        <w:t>条件区块：没有已接受且通过实际变量门控的状态时省略本节。</w:t>
+        <w:rPr>
+          <w:rFonts w:ascii="Arial" w:hAnsi="Arial" w:eastAsia="黑体"/>
+          <w:b/>
+          <w:sz w:val="21"/>
+        </w:rPr>
+        <w:t>状态说明：</w:t>
+      </w:r>
+      <w:r>
+        <w:rPr>
+          <w:rFonts w:ascii="Arial" w:hAnsi="Arial" w:eastAsia="宋体"/>
+          <w:sz w:val="21"/>
+        </w:rPr>
+        <w:t>[StateModelId]</w:t>
+      </w:r>
+    </w:p>
+    <w:p>
+      <w:pPr>
+        <w:spacing w:after="80"/>
+        <w:jc w:val="left"/>
+      </w:pPr>
+      <w:r>
+        <w:rPr>
+          <w:rFonts w:ascii="Arial" w:hAnsi="Arial" w:eastAsia="黑体"/>
+          <w:b/>
+          <w:sz w:val="21"/>
+        </w:rPr>
+        <w:t>实现策略：</w:t>
+      </w:r>
+      <w:r>
+        <w:rPr>
+          <w:rFonts w:ascii="Arial" w:hAnsi="Arial" w:eastAsia="宋体"/>
+          <w:sz w:val="21"/>
+        </w:rPr>
+        <w:t>[ImplementationStrategy]</w:t>
+      </w:r>
+    </w:p>
+    <w:p>
+      <w:pPr>
+        <w:spacing w:after="80"/>
+        <w:jc w:val="left"/>
+      </w:pPr>
+      <w:r>
+        <w:rPr>
+          <w:rFonts w:ascii="Arial" w:hAnsi="Arial" w:eastAsia="黑体"/>
+          <w:b/>
+          <w:sz w:val="21"/>
+        </w:rPr>
+        <w:t>控制意图：</w:t>
+      </w:r>
+      <w:r>
+        <w:rPr>
+          <w:rFonts w:ascii="Arial" w:hAnsi="Arial" w:eastAsia="宋体"/>
+          <w:sz w:val="21"/>
+        </w:rPr>
+        <w:t>[StateControlIntent]</w:t>
       </w:r>
     </w:p>
     <w:tbl>
@@ -1382,10 +1268,1119 @@
     </w:p>
     <w:p>
       <w:pPr>
+        <w:pStyle w:val="TemplateNote"/>
+        <w:keepNext/>
+      </w:pPr>
+      <w:r>
+        <w:t>条件区块：仅在本资产有跨资产定位依赖时保留；支持依赖随使用它的资产记录，不再生成文档级独立章节。</w:t>
+      </w:r>
+    </w:p>
+    <w:p>
+      <w:pPr>
+        <w:spacing w:after="80"/>
+        <w:jc w:val="left"/>
+      </w:pPr>
+      <w:r>
+        <w:rPr>
+          <w:rFonts w:ascii="Arial" w:hAnsi="Arial" w:eastAsia="黑体"/>
+          <w:b/>
+          <w:sz w:val="21"/>
+        </w:rPr>
+        <w:t>支持依赖：</w:t>
+      </w:r>
+      <w:r>
+        <w:rPr>
+          <w:rFonts w:ascii="Arial" w:hAnsi="Arial" w:eastAsia="宋体"/>
+          <w:sz w:val="21"/>
+        </w:rPr>
+        <w:t>[SupportDependencyId]</w:t>
+      </w:r>
+    </w:p>
+    <w:tbl>
+      <w:tblPr>
+        <w:tblStyle w:val="TableGrid"/>
+        <w:tblW w:type="auto" w:w="0"/>
+        <w:jc w:val="center"/>
+        <w:tblLayout w:type="fixed"/>
+        <w:tblLook w:firstColumn="1" w:firstRow="1" w:lastColumn="0" w:lastRow="0" w:noHBand="0" w:noVBand="1" w:val="04A0"/>
+        <w:tblBorders>
+          <w:top w:val="single" w:sz="5" w:color="BCCBDA"/>
+          <w:left w:val="single" w:sz="5" w:color="BCCBDA"/>
+          <w:bottom w:val="single" w:sz="5" w:color="BCCBDA"/>
+          <w:right w:val="single" w:sz="5" w:color="BCCBDA"/>
+          <w:insideH w:val="single" w:sz="5" w:color="BCCBDA"/>
+          <w:insideV w:val="single" w:sz="5" w:color="BCCBDA"/>
+        </w:tblBorders>
+      </w:tblPr>
+      <w:tblGrid>
+        <w:gridCol w:w="4153"/>
+        <w:gridCol w:w="4153"/>
+      </w:tblGrid>
+      <w:tr>
+        <w:trPr>
+          <w:tblHeader w:val="true"/>
+          <w:cantSplit/>
+        </w:trPr>
+        <w:tc>
+          <w:tcPr>
+            <w:tcW w:type="dxa" w:w="2381"/>
+            <w:shd w:fill="E7EFF8"/>
+            <w:vAlign w:val="center"/>
+            <w:tcMar>
+              <w:top w:w="100" w:type="dxa"/>
+              <w:start w:w="120" w:type="dxa"/>
+              <w:bottom w:w="100" w:type="dxa"/>
+              <w:end w:w="120" w:type="dxa"/>
+            </w:tcMar>
+          </w:tcPr>
+          <w:p>
+            <w:pPr>
+              <w:spacing w:after="0" w:before="0"/>
+              <w:jc w:val="left"/>
+            </w:pPr>
+            <w:r/>
+            <w:r>
+              <w:rPr>
+                <w:rFonts w:ascii="Arial" w:hAnsi="Arial" w:eastAsia="等线"/>
+                <w:b/>
+                <w:color w:val="1F4E79"/>
+                <w:sz w:val="18"/>
+              </w:rPr>
+              <w:t>Parent Class</w:t>
+            </w:r>
+          </w:p>
+        </w:tc>
+        <w:tc>
+          <w:tcPr>
+            <w:tcW w:type="dxa" w:w="5896"/>
+            <w:shd w:fill="E7EFF8"/>
+            <w:vAlign w:val="center"/>
+            <w:tcMar>
+              <w:top w:w="100" w:type="dxa"/>
+              <w:start w:w="120" w:type="dxa"/>
+              <w:bottom w:w="100" w:type="dxa"/>
+              <w:end w:w="120" w:type="dxa"/>
+            </w:tcMar>
+          </w:tcPr>
+          <w:p>
+            <w:pPr>
+              <w:spacing w:after="0" w:before="0"/>
+              <w:jc w:val="left"/>
+            </w:pPr>
+            <w:r/>
+            <w:r>
+              <w:rPr>
+                <w:rFonts w:ascii="Arial" w:hAnsi="Arial" w:eastAsia="等线"/>
+                <w:b/>
+                <w:color w:val="1F4E79"/>
+                <w:sz w:val="18"/>
+              </w:rPr>
+              <w:t>依赖定位节点</w:t>
+            </w:r>
+          </w:p>
+        </w:tc>
+      </w:tr>
+      <w:tr>
+        <w:trPr>
+          <w:cantSplit/>
+        </w:trPr>
+        <w:tc>
+          <w:tcPr>
+            <w:tcW w:type="dxa" w:w="2381"/>
+            <w:vAlign w:val="center"/>
+            <w:tcMar>
+              <w:top w:w="100" w:type="dxa"/>
+              <w:start w:w="120" w:type="dxa"/>
+              <w:bottom w:w="100" w:type="dxa"/>
+              <w:end w:w="120" w:type="dxa"/>
+            </w:tcMar>
+          </w:tcPr>
+          <w:p>
+            <w:pPr>
+              <w:spacing w:after="0" w:before="0"/>
+              <w:jc w:val="left"/>
+            </w:pPr>
+            <w:r/>
+            <w:r>
+              <w:rPr>
+                <w:rFonts w:ascii="Arial" w:hAnsi="Arial" w:eastAsia="等线"/>
+                <w:b w:val="0"/>
+                <w:color w:val="5F6B7A"/>
+                <w:sz w:val="16"/>
+              </w:rPr>
+              <w:t>[DependencyParentClass]</w:t>
+            </w:r>
+          </w:p>
+        </w:tc>
+        <w:tc>
+          <w:tcPr>
+            <w:tcW w:type="dxa" w:w="5896"/>
+            <w:vAlign w:val="center"/>
+            <w:tcMar>
+              <w:top w:w="100" w:type="dxa"/>
+              <w:start w:w="120" w:type="dxa"/>
+              <w:bottom w:w="100" w:type="dxa"/>
+              <w:end w:w="120" w:type="dxa"/>
+            </w:tcMar>
+          </w:tcPr>
+          <w:p>
+            <w:pPr>
+              <w:spacing w:after="0" w:before="0"/>
+              <w:jc w:val="left"/>
+            </w:pPr>
+            <w:r/>
+            <w:r>
+              <w:rPr>
+                <w:rFonts w:ascii="Arial" w:hAnsi="Arial" w:eastAsia="等线"/>
+                <w:b w:val="0"/>
+                <w:color w:val="5F6B7A"/>
+                <w:sz w:val="16"/>
+              </w:rPr>
+              <w:t>[DependencyLocatorNodes]</w:t>
+            </w:r>
+          </w:p>
+        </w:tc>
+      </w:tr>
+    </w:tbl>
+    <w:p>
+      <w:pPr>
+        <w:spacing w:after="0"/>
+      </w:pPr>
+    </w:p>
+    <w:p>
+      <w:r>
+        <w:br w:type="page"/>
+      </w:r>
+    </w:p>
+    <w:p>
+      <w:pPr>
         <w:pStyle w:val="ToolSection"/>
       </w:pPr>
       <w:r>
-        <w:t>6. 构建偏差</w:t>
+        <w:t>2. 其他资产程序说明</w:t>
+      </w:r>
+    </w:p>
+    <w:p>
+      <w:pPr>
+        <w:pStyle w:val="TemplateNote"/>
+        <w:keepNext/>
+      </w:pPr>
+      <w:r>
+        <w:t>条件模块：仅当动态集合、状态模型或支持依赖的归属资产不在第 1 模块时保留；按归属资产克隆下面的完整分组，每组只写一次归属资产路径，并省略无内容的子区块。省略本模块时，后续全局模块必须连续重编号。</w:t>
+      </w:r>
+    </w:p>
+    <w:p>
+      <w:pPr>
+        <w:pStyle w:val="Heading2"/>
+      </w:pPr>
+      <w:r>
+        <w:t>[OtherAssetName][OtherChineseFunctionalName]</w:t>
+      </w:r>
+    </w:p>
+    <w:p>
+      <w:pPr>
+        <w:spacing w:after="80"/>
+        <w:jc w:val="left"/>
+      </w:pPr>
+      <w:r>
+        <w:rPr>
+          <w:rFonts w:ascii="Arial" w:hAnsi="Arial" w:eastAsia="黑体"/>
+          <w:b/>
+          <w:sz w:val="21"/>
+        </w:rPr>
+        <w:t>资产路径：</w:t>
+      </w:r>
+      <w:r>
+        <w:rPr>
+          <w:rFonts w:ascii="Arial" w:hAnsi="Arial" w:eastAsia="宋体"/>
+          <w:sz w:val="21"/>
+        </w:rPr>
+        <w:t>[OtherAssetPath]</w:t>
+      </w:r>
+    </w:p>
+    <w:p>
+      <w:pPr>
+        <w:pStyle w:val="TemplateNote"/>
+        <w:keepNext/>
+      </w:pPr>
+      <w:r>
+        <w:t>条件区块：仅在上方其他资产拥有动态集合时保留；只克隆归属于上方其他资产的集合，每个集合独立一行并明确容器与 EntryClass 关系。</w:t>
+      </w:r>
+    </w:p>
+    <w:p>
+      <w:pPr>
+        <w:keepNext/>
+        <w:spacing w:after="80"/>
+        <w:jc w:val="left"/>
+      </w:pPr>
+      <w:r>
+        <w:rPr>
+          <w:rFonts w:ascii="Arial" w:hAnsi="Arial" w:eastAsia="黑体"/>
+          <w:b/>
+          <w:sz w:val="21"/>
+        </w:rPr>
+        <w:t>动态集合：</w:t>
+      </w:r>
+      <w:r>
+        <w:rPr>
+          <w:rFonts w:ascii="Arial" w:hAnsi="Arial" w:eastAsia="宋体"/>
+          <w:sz w:val="21"/>
+        </w:rPr>
+        <w:t>[CollectionId]</w:t>
+      </w:r>
+    </w:p>
+    <w:tbl>
+      <w:tblPr>
+        <w:tblStyle w:val="TableGrid"/>
+        <w:tblW w:type="auto" w:w="0"/>
+        <w:jc w:val="center"/>
+        <w:tblLayout w:type="fixed"/>
+        <w:tblLook w:firstColumn="1" w:firstRow="1" w:lastColumn="0" w:lastRow="0" w:noHBand="0" w:noVBand="1" w:val="04A0"/>
+        <w:tblBorders>
+          <w:top w:val="single" w:sz="5" w:color="BCCBDA"/>
+          <w:left w:val="single" w:sz="5" w:color="BCCBDA"/>
+          <w:bottom w:val="single" w:sz="5" w:color="BCCBDA"/>
+          <w:right w:val="single" w:sz="5" w:color="BCCBDA"/>
+          <w:insideH w:val="single" w:sz="5" w:color="BCCBDA"/>
+          <w:insideV w:val="single" w:sz="5" w:color="BCCBDA"/>
+        </w:tblBorders>
+      </w:tblPr>
+      <w:tblGrid>
+        <w:gridCol w:w="2076"/>
+        <w:gridCol w:w="2076"/>
+        <w:gridCol w:w="2076"/>
+        <w:gridCol w:w="2076"/>
+      </w:tblGrid>
+      <w:tr>
+        <w:trPr>
+          <w:tblHeader w:val="true"/>
+          <w:cantSplit/>
+        </w:trPr>
+        <w:tc>
+          <w:tcPr>
+            <w:tcW w:type="dxa" w:w="1361"/>
+            <w:shd w:fill="E7EFF8"/>
+            <w:vAlign w:val="center"/>
+            <w:tcMar>
+              <w:top w:w="100" w:type="dxa"/>
+              <w:start w:w="120" w:type="dxa"/>
+              <w:bottom w:w="100" w:type="dxa"/>
+              <w:end w:w="120" w:type="dxa"/>
+            </w:tcMar>
+          </w:tcPr>
+          <w:p>
+            <w:pPr>
+              <w:spacing w:after="0" w:before="0"/>
+              <w:jc w:val="left"/>
+            </w:pPr>
+            <w:r/>
+            <w:r>
+              <w:rPr>
+                <w:rFonts w:ascii="Arial" w:hAnsi="Arial" w:eastAsia="等线"/>
+                <w:b/>
+                <w:color w:val="1F4E79"/>
+                <w:sz w:val="18"/>
+              </w:rPr>
+              <w:t>集合标识</w:t>
+            </w:r>
+          </w:p>
+        </w:tc>
+        <w:tc>
+          <w:tcPr>
+            <w:tcW w:type="dxa" w:w="1701"/>
+            <w:shd w:fill="E7EFF8"/>
+            <w:vAlign w:val="center"/>
+            <w:tcMar>
+              <w:top w:w="100" w:type="dxa"/>
+              <w:start w:w="120" w:type="dxa"/>
+              <w:bottom w:w="100" w:type="dxa"/>
+              <w:end w:w="120" w:type="dxa"/>
+            </w:tcMar>
+          </w:tcPr>
+          <w:p>
+            <w:pPr>
+              <w:spacing w:after="0" w:before="0"/>
+              <w:jc w:val="left"/>
+            </w:pPr>
+            <w:r/>
+            <w:r>
+              <w:rPr>
+                <w:rFonts w:ascii="Arial" w:hAnsi="Arial" w:eastAsia="等线"/>
+                <w:b/>
+                <w:color w:val="1F4E79"/>
+                <w:sz w:val="18"/>
+              </w:rPr>
+              <w:t>容器控件</w:t>
+            </w:r>
+          </w:p>
+        </w:tc>
+        <w:tc>
+          <w:tcPr>
+            <w:tcW w:type="dxa" w:w="3742"/>
+            <w:shd w:fill="E7EFF8"/>
+            <w:vAlign w:val="center"/>
+            <w:tcMar>
+              <w:top w:w="100" w:type="dxa"/>
+              <w:start w:w="120" w:type="dxa"/>
+              <w:bottom w:w="100" w:type="dxa"/>
+              <w:end w:w="120" w:type="dxa"/>
+            </w:tcMar>
+          </w:tcPr>
+          <w:p>
+            <w:pPr>
+              <w:spacing w:after="0" w:before="0"/>
+              <w:jc w:val="left"/>
+            </w:pPr>
+            <w:r/>
+            <w:r>
+              <w:rPr>
+                <w:rFonts w:ascii="Arial" w:hAnsi="Arial" w:eastAsia="等线"/>
+                <w:b/>
+                <w:color w:val="1F4E79"/>
+                <w:sz w:val="18"/>
+              </w:rPr>
+              <w:t>EntryClass</w:t>
+            </w:r>
+          </w:p>
+        </w:tc>
+        <w:tc>
+          <w:tcPr>
+            <w:tcW w:type="dxa" w:w="1474"/>
+            <w:shd w:fill="E7EFF8"/>
+            <w:vAlign w:val="center"/>
+            <w:tcMar>
+              <w:top w:w="100" w:type="dxa"/>
+              <w:start w:w="120" w:type="dxa"/>
+              <w:bottom w:w="100" w:type="dxa"/>
+              <w:end w:w="120" w:type="dxa"/>
+            </w:tcMar>
+          </w:tcPr>
+          <w:p>
+            <w:pPr>
+              <w:spacing w:after="0" w:before="0"/>
+              <w:jc w:val="left"/>
+            </w:pPr>
+            <w:r/>
+            <w:r>
+              <w:rPr>
+                <w:rFonts w:ascii="Arial" w:hAnsi="Arial" w:eastAsia="等线"/>
+                <w:b/>
+                <w:color w:val="1F4E79"/>
+                <w:sz w:val="18"/>
+              </w:rPr>
+              <w:t>程序用途</w:t>
+            </w:r>
+          </w:p>
+        </w:tc>
+      </w:tr>
+      <w:tr>
+        <w:trPr>
+          <w:cantSplit/>
+        </w:trPr>
+        <w:tc>
+          <w:tcPr>
+            <w:tcW w:type="dxa" w:w="1361"/>
+            <w:vAlign w:val="center"/>
+            <w:tcMar>
+              <w:top w:w="100" w:type="dxa"/>
+              <w:start w:w="120" w:type="dxa"/>
+              <w:bottom w:w="100" w:type="dxa"/>
+              <w:end w:w="120" w:type="dxa"/>
+            </w:tcMar>
+          </w:tcPr>
+          <w:p>
+            <w:pPr>
+              <w:spacing w:after="0" w:before="0"/>
+              <w:jc w:val="left"/>
+            </w:pPr>
+            <w:r/>
+            <w:r>
+              <w:rPr>
+                <w:rFonts w:ascii="Arial" w:hAnsi="Arial" w:eastAsia="等线"/>
+                <w:b w:val="0"/>
+                <w:color w:val="5F6B7A"/>
+                <w:sz w:val="16"/>
+              </w:rPr>
+              <w:t>[CollectionId]</w:t>
+            </w:r>
+          </w:p>
+        </w:tc>
+        <w:tc>
+          <w:tcPr>
+            <w:tcW w:type="dxa" w:w="1701"/>
+            <w:vAlign w:val="center"/>
+            <w:tcMar>
+              <w:top w:w="100" w:type="dxa"/>
+              <w:start w:w="120" w:type="dxa"/>
+              <w:bottom w:w="100" w:type="dxa"/>
+              <w:end w:w="120" w:type="dxa"/>
+            </w:tcMar>
+          </w:tcPr>
+          <w:p>
+            <w:pPr>
+              <w:spacing w:after="0" w:before="0"/>
+              <w:jc w:val="left"/>
+            </w:pPr>
+            <w:r/>
+            <w:r>
+              <w:rPr>
+                <w:rFonts w:ascii="Arial" w:hAnsi="Arial" w:eastAsia="等线"/>
+                <w:b w:val="0"/>
+                <w:color w:val="5F6B7A"/>
+                <w:sz w:val="16"/>
+              </w:rPr>
+              <w:t>[CollectionWidget]</w:t>
+            </w:r>
+          </w:p>
+        </w:tc>
+        <w:tc>
+          <w:tcPr>
+            <w:tcW w:type="dxa" w:w="3742"/>
+            <w:vAlign w:val="center"/>
+            <w:tcMar>
+              <w:top w:w="100" w:type="dxa"/>
+              <w:start w:w="120" w:type="dxa"/>
+              <w:bottom w:w="100" w:type="dxa"/>
+              <w:end w:w="120" w:type="dxa"/>
+            </w:tcMar>
+          </w:tcPr>
+          <w:p>
+            <w:pPr>
+              <w:spacing w:after="0" w:before="0"/>
+              <w:jc w:val="left"/>
+            </w:pPr>
+            <w:r/>
+            <w:r>
+              <w:rPr>
+                <w:rFonts w:ascii="Arial" w:hAnsi="Arial" w:eastAsia="等线"/>
+                <w:b w:val="0"/>
+                <w:color w:val="5F6B7A"/>
+                <w:sz w:val="16"/>
+              </w:rPr>
+              <w:t>[EntryWidgetClass]</w:t>
+            </w:r>
+          </w:p>
+        </w:tc>
+        <w:tc>
+          <w:tcPr>
+            <w:tcW w:type="dxa" w:w="1474"/>
+            <w:vAlign w:val="center"/>
+            <w:tcMar>
+              <w:top w:w="100" w:type="dxa"/>
+              <w:start w:w="120" w:type="dxa"/>
+              <w:bottom w:w="100" w:type="dxa"/>
+              <w:end w:w="120" w:type="dxa"/>
+            </w:tcMar>
+          </w:tcPr>
+          <w:p>
+            <w:pPr>
+              <w:spacing w:after="0" w:before="0"/>
+              <w:jc w:val="left"/>
+            </w:pPr>
+            <w:r/>
+            <w:r>
+              <w:rPr>
+                <w:rFonts w:ascii="Arial" w:hAnsi="Arial" w:eastAsia="等线"/>
+                <w:b w:val="0"/>
+                <w:color w:val="5F6B7A"/>
+                <w:sz w:val="16"/>
+              </w:rPr>
+              <w:t>[CollectionPurpose]</w:t>
+            </w:r>
+          </w:p>
+        </w:tc>
+      </w:tr>
+    </w:tbl>
+    <w:p>
+      <w:pPr>
+        <w:spacing w:after="0"/>
+      </w:pPr>
+    </w:p>
+    <w:p>
+      <w:pPr>
+        <w:pStyle w:val="TemplateNote"/>
+        <w:keepNext/>
+      </w:pPr>
+      <w:r>
+        <w:t>条件区块：仅在上方其他资产拥有已接受且通过实际变量门控的状态模型时保留；只克隆归属于上方其他资产的状态项。</w:t>
+      </w:r>
+    </w:p>
+    <w:p>
+      <w:pPr>
+        <w:keepNext/>
+        <w:spacing w:after="80"/>
+        <w:jc w:val="left"/>
+      </w:pPr>
+      <w:r>
+        <w:rPr>
+          <w:rFonts w:ascii="Arial" w:hAnsi="Arial" w:eastAsia="黑体"/>
+          <w:b/>
+          <w:sz w:val="21"/>
+        </w:rPr>
+        <w:t>状态说明：</w:t>
+      </w:r>
+      <w:r>
+        <w:rPr>
+          <w:rFonts w:ascii="Arial" w:hAnsi="Arial" w:eastAsia="宋体"/>
+          <w:sz w:val="21"/>
+        </w:rPr>
+        <w:t>[StateModelId]</w:t>
+      </w:r>
+    </w:p>
+    <w:p>
+      <w:pPr>
+        <w:spacing w:after="80"/>
+        <w:jc w:val="left"/>
+      </w:pPr>
+      <w:r>
+        <w:rPr>
+          <w:rFonts w:ascii="Arial" w:hAnsi="Arial" w:eastAsia="黑体"/>
+          <w:b/>
+          <w:sz w:val="21"/>
+        </w:rPr>
+        <w:t>实现策略：</w:t>
+      </w:r>
+      <w:r>
+        <w:rPr>
+          <w:rFonts w:ascii="Arial" w:hAnsi="Arial" w:eastAsia="宋体"/>
+          <w:sz w:val="21"/>
+        </w:rPr>
+        <w:t>[ImplementationStrategy]</w:t>
+      </w:r>
+    </w:p>
+    <w:p>
+      <w:pPr>
+        <w:spacing w:after="80"/>
+        <w:jc w:val="left"/>
+      </w:pPr>
+      <w:r>
+        <w:rPr>
+          <w:rFonts w:ascii="Arial" w:hAnsi="Arial" w:eastAsia="黑体"/>
+          <w:b/>
+          <w:sz w:val="21"/>
+        </w:rPr>
+        <w:t>控制意图：</w:t>
+      </w:r>
+      <w:r>
+        <w:rPr>
+          <w:rFonts w:ascii="Arial" w:hAnsi="Arial" w:eastAsia="宋体"/>
+          <w:sz w:val="21"/>
+        </w:rPr>
+        <w:t>[StateControlIntent]</w:t>
+      </w:r>
+    </w:p>
+    <w:tbl>
+      <w:tblPr>
+        <w:tblStyle w:val="TableGrid"/>
+        <w:tblW w:type="auto" w:w="0"/>
+        <w:jc w:val="center"/>
+        <w:tblLayout w:type="fixed"/>
+        <w:tblLook w:firstColumn="1" w:firstRow="1" w:lastColumn="0" w:lastRow="0" w:noHBand="0" w:noVBand="1" w:val="04A0"/>
+        <w:tblBorders>
+          <w:top w:val="single" w:sz="5" w:color="BCCBDA"/>
+          <w:left w:val="single" w:sz="5" w:color="BCCBDA"/>
+          <w:bottom w:val="single" w:sz="5" w:color="BCCBDA"/>
+          <w:right w:val="single" w:sz="5" w:color="BCCBDA"/>
+          <w:insideH w:val="single" w:sz="5" w:color="BCCBDA"/>
+          <w:insideV w:val="single" w:sz="5" w:color="BCCBDA"/>
+        </w:tblBorders>
+      </w:tblPr>
+      <w:tblGrid>
+        <w:gridCol w:w="1661"/>
+        <w:gridCol w:w="1661"/>
+        <w:gridCol w:w="1661"/>
+        <w:gridCol w:w="1661"/>
+        <w:gridCol w:w="1661"/>
+      </w:tblGrid>
+      <w:tr>
+        <w:trPr>
+          <w:tblHeader w:val="true"/>
+          <w:cantSplit/>
+        </w:trPr>
+        <w:tc>
+          <w:tcPr>
+            <w:tcW w:type="dxa" w:w="1531"/>
+            <w:shd w:fill="E7EFF8"/>
+            <w:vAlign w:val="center"/>
+            <w:tcMar>
+              <w:top w:w="100" w:type="dxa"/>
+              <w:start w:w="120" w:type="dxa"/>
+              <w:bottom w:w="100" w:type="dxa"/>
+              <w:end w:w="120" w:type="dxa"/>
+            </w:tcMar>
+          </w:tcPr>
+          <w:p>
+            <w:pPr>
+              <w:spacing w:after="0" w:before="0"/>
+              <w:jc w:val="left"/>
+            </w:pPr>
+            <w:r/>
+            <w:r>
+              <w:rPr>
+                <w:rFonts w:ascii="Arial" w:hAnsi="Arial" w:eastAsia="等线"/>
+                <w:b/>
+                <w:color w:val="1F4E79"/>
+                <w:sz w:val="18"/>
+              </w:rPr>
+              <w:t>状态轴</w:t>
+            </w:r>
+          </w:p>
+        </w:tc>
+        <w:tc>
+          <w:tcPr>
+            <w:tcW w:type="dxa" w:w="1928"/>
+            <w:shd w:fill="E7EFF8"/>
+            <w:vAlign w:val="center"/>
+            <w:tcMar>
+              <w:top w:w="100" w:type="dxa"/>
+              <w:start w:w="120" w:type="dxa"/>
+              <w:bottom w:w="100" w:type="dxa"/>
+              <w:end w:w="120" w:type="dxa"/>
+            </w:tcMar>
+          </w:tcPr>
+          <w:p>
+            <w:pPr>
+              <w:spacing w:after="0" w:before="0"/>
+              <w:jc w:val="left"/>
+            </w:pPr>
+            <w:r/>
+            <w:r>
+              <w:rPr>
+                <w:rFonts w:ascii="Arial" w:hAnsi="Arial" w:eastAsia="等线"/>
+                <w:b/>
+                <w:color w:val="1F4E79"/>
+                <w:sz w:val="18"/>
+              </w:rPr>
+              <w:t>状态标识</w:t>
+            </w:r>
+          </w:p>
+        </w:tc>
+        <w:tc>
+          <w:tcPr>
+            <w:tcW w:type="dxa" w:w="1361"/>
+            <w:shd w:fill="E7EFF8"/>
+            <w:vAlign w:val="center"/>
+            <w:tcMar>
+              <w:top w:w="100" w:type="dxa"/>
+              <w:start w:w="120" w:type="dxa"/>
+              <w:bottom w:w="100" w:type="dxa"/>
+              <w:end w:w="120" w:type="dxa"/>
+            </w:tcMar>
+          </w:tcPr>
+          <w:p>
+            <w:pPr>
+              <w:spacing w:after="0" w:before="0"/>
+              <w:jc w:val="left"/>
+            </w:pPr>
+            <w:r/>
+            <w:r>
+              <w:rPr>
+                <w:rFonts w:ascii="Arial" w:hAnsi="Arial" w:eastAsia="等线"/>
+                <w:b/>
+                <w:color w:val="1F4E79"/>
+                <w:sz w:val="18"/>
+              </w:rPr>
+              <w:t>状态名</w:t>
+            </w:r>
+          </w:p>
+        </w:tc>
+        <w:tc>
+          <w:tcPr>
+            <w:tcW w:type="dxa" w:w="907"/>
+            <w:shd w:fill="E7EFF8"/>
+            <w:vAlign w:val="center"/>
+            <w:tcMar>
+              <w:top w:w="100" w:type="dxa"/>
+              <w:start w:w="120" w:type="dxa"/>
+              <w:bottom w:w="100" w:type="dxa"/>
+              <w:end w:w="120" w:type="dxa"/>
+            </w:tcMar>
+          </w:tcPr>
+          <w:p>
+            <w:pPr>
+              <w:spacing w:after="0" w:before="0"/>
+              <w:jc w:val="left"/>
+            </w:pPr>
+            <w:r/>
+            <w:r>
+              <w:rPr>
+                <w:rFonts w:ascii="Arial" w:hAnsi="Arial" w:eastAsia="等线"/>
+                <w:b/>
+                <w:color w:val="1F4E79"/>
+                <w:sz w:val="18"/>
+              </w:rPr>
+              <w:t>默认</w:t>
+            </w:r>
+          </w:p>
+        </w:tc>
+        <w:tc>
+          <w:tcPr>
+            <w:tcW w:type="dxa" w:w="2551"/>
+            <w:shd w:fill="E7EFF8"/>
+            <w:vAlign w:val="center"/>
+            <w:tcMar>
+              <w:top w:w="100" w:type="dxa"/>
+              <w:start w:w="120" w:type="dxa"/>
+              <w:bottom w:w="100" w:type="dxa"/>
+              <w:end w:w="120" w:type="dxa"/>
+            </w:tcMar>
+          </w:tcPr>
+          <w:p>
+            <w:pPr>
+              <w:spacing w:after="0" w:before="0"/>
+              <w:jc w:val="left"/>
+            </w:pPr>
+            <w:r/>
+            <w:r>
+              <w:rPr>
+                <w:rFonts w:ascii="Arial" w:hAnsi="Arial" w:eastAsia="等线"/>
+                <w:b/>
+                <w:color w:val="1F4E79"/>
+                <w:sz w:val="18"/>
+              </w:rPr>
+              <w:t>目标分支或结果</w:t>
+            </w:r>
+          </w:p>
+        </w:tc>
+      </w:tr>
+      <w:tr>
+        <w:trPr>
+          <w:cantSplit/>
+        </w:trPr>
+        <w:tc>
+          <w:tcPr>
+            <w:tcW w:type="dxa" w:w="1531"/>
+            <w:vAlign w:val="center"/>
+            <w:tcMar>
+              <w:top w:w="100" w:type="dxa"/>
+              <w:start w:w="120" w:type="dxa"/>
+              <w:bottom w:w="100" w:type="dxa"/>
+              <w:end w:w="120" w:type="dxa"/>
+            </w:tcMar>
+          </w:tcPr>
+          <w:p>
+            <w:pPr>
+              <w:spacing w:after="0" w:before="0"/>
+              <w:jc w:val="left"/>
+            </w:pPr>
+            <w:r/>
+            <w:r>
+              <w:rPr>
+                <w:rFonts w:ascii="Arial" w:hAnsi="Arial" w:eastAsia="等线"/>
+                <w:b w:val="0"/>
+                <w:color w:val="5F6B7A"/>
+                <w:sz w:val="16"/>
+              </w:rPr>
+              <w:t>[StateAxis]</w:t>
+            </w:r>
+          </w:p>
+        </w:tc>
+        <w:tc>
+          <w:tcPr>
+            <w:tcW w:type="dxa" w:w="1928"/>
+            <w:vAlign w:val="center"/>
+            <w:tcMar>
+              <w:top w:w="100" w:type="dxa"/>
+              <w:start w:w="120" w:type="dxa"/>
+              <w:bottom w:w="100" w:type="dxa"/>
+              <w:end w:w="120" w:type="dxa"/>
+            </w:tcMar>
+          </w:tcPr>
+          <w:p>
+            <w:pPr>
+              <w:spacing w:after="0" w:before="0"/>
+              <w:jc w:val="left"/>
+            </w:pPr>
+            <w:r/>
+            <w:r>
+              <w:rPr>
+                <w:rFonts w:ascii="Arial" w:hAnsi="Arial" w:eastAsia="等线"/>
+                <w:b w:val="0"/>
+                <w:color w:val="5F6B7A"/>
+                <w:sz w:val="16"/>
+              </w:rPr>
+              <w:t>[StateId]</w:t>
+            </w:r>
+          </w:p>
+        </w:tc>
+        <w:tc>
+          <w:tcPr>
+            <w:tcW w:type="dxa" w:w="1361"/>
+            <w:vAlign w:val="center"/>
+            <w:tcMar>
+              <w:top w:w="100" w:type="dxa"/>
+              <w:start w:w="120" w:type="dxa"/>
+              <w:bottom w:w="100" w:type="dxa"/>
+              <w:end w:w="120" w:type="dxa"/>
+            </w:tcMar>
+          </w:tcPr>
+          <w:p>
+            <w:pPr>
+              <w:spacing w:after="0" w:before="0"/>
+              <w:jc w:val="left"/>
+            </w:pPr>
+            <w:r/>
+            <w:r>
+              <w:rPr>
+                <w:rFonts w:ascii="Arial" w:hAnsi="Arial" w:eastAsia="等线"/>
+                <w:b w:val="0"/>
+                <w:color w:val="5F6B7A"/>
+                <w:sz w:val="16"/>
+              </w:rPr>
+              <w:t>[StateName]</w:t>
+            </w:r>
+          </w:p>
+        </w:tc>
+        <w:tc>
+          <w:tcPr>
+            <w:tcW w:type="dxa" w:w="907"/>
+            <w:vAlign w:val="center"/>
+            <w:tcMar>
+              <w:top w:w="100" w:type="dxa"/>
+              <w:start w:w="120" w:type="dxa"/>
+              <w:bottom w:w="100" w:type="dxa"/>
+              <w:end w:w="120" w:type="dxa"/>
+            </w:tcMar>
+          </w:tcPr>
+          <w:p>
+            <w:pPr>
+              <w:spacing w:after="0" w:before="0"/>
+              <w:jc w:val="left"/>
+            </w:pPr>
+            <w:r/>
+            <w:r>
+              <w:rPr>
+                <w:rFonts w:ascii="Arial" w:hAnsi="Arial" w:eastAsia="等线"/>
+                <w:b w:val="0"/>
+                <w:color w:val="5F6B7A"/>
+                <w:sz w:val="16"/>
+              </w:rPr>
+              <w:t>[DefaultState]</w:t>
+            </w:r>
+          </w:p>
+        </w:tc>
+        <w:tc>
+          <w:tcPr>
+            <w:tcW w:type="dxa" w:w="2551"/>
+            <w:vAlign w:val="center"/>
+            <w:tcMar>
+              <w:top w:w="100" w:type="dxa"/>
+              <w:start w:w="120" w:type="dxa"/>
+              <w:bottom w:w="100" w:type="dxa"/>
+              <w:end w:w="120" w:type="dxa"/>
+            </w:tcMar>
+          </w:tcPr>
+          <w:p>
+            <w:pPr>
+              <w:spacing w:after="0" w:before="0"/>
+              <w:jc w:val="left"/>
+            </w:pPr>
+            <w:r/>
+            <w:r>
+              <w:rPr>
+                <w:rFonts w:ascii="Arial" w:hAnsi="Arial" w:eastAsia="等线"/>
+                <w:b w:val="0"/>
+                <w:color w:val="5F6B7A"/>
+                <w:sz w:val="16"/>
+              </w:rPr>
+              <w:t>[StateTarget]</w:t>
+            </w:r>
+          </w:p>
+        </w:tc>
+      </w:tr>
+    </w:tbl>
+    <w:p>
+      <w:pPr>
+        <w:spacing w:after="0"/>
+      </w:pPr>
+    </w:p>
+    <w:p>
+      <w:pPr>
+        <w:pStyle w:val="TemplateNote"/>
+        <w:keepNext/>
+      </w:pPr>
+      <w:r>
+        <w:t>条件区块：仅在上方其他资产有跨资产定位依赖时保留；支持依赖随使用它的资产记录，不再生成文档级独立章节。</w:t>
+      </w:r>
+    </w:p>
+    <w:p>
+      <w:pPr>
+        <w:spacing w:after="80"/>
+        <w:jc w:val="left"/>
+      </w:pPr>
+      <w:r>
+        <w:rPr>
+          <w:rFonts w:ascii="Arial" w:hAnsi="Arial" w:eastAsia="黑体"/>
+          <w:b/>
+          <w:sz w:val="21"/>
+        </w:rPr>
+        <w:t>支持依赖：</w:t>
+      </w:r>
+      <w:r>
+        <w:rPr>
+          <w:rFonts w:ascii="Arial" w:hAnsi="Arial" w:eastAsia="宋体"/>
+          <w:sz w:val="21"/>
+        </w:rPr>
+        <w:t>[SupportDependencyId]</w:t>
+      </w:r>
+    </w:p>
+    <w:tbl>
+      <w:tblPr>
+        <w:tblStyle w:val="TableGrid"/>
+        <w:tblW w:type="auto" w:w="0"/>
+        <w:jc w:val="center"/>
+        <w:tblLayout w:type="fixed"/>
+        <w:tblLook w:firstColumn="1" w:firstRow="1" w:lastColumn="0" w:lastRow="0" w:noHBand="0" w:noVBand="1" w:val="04A0"/>
+        <w:tblBorders>
+          <w:top w:val="single" w:sz="5" w:color="BCCBDA"/>
+          <w:left w:val="single" w:sz="5" w:color="BCCBDA"/>
+          <w:bottom w:val="single" w:sz="5" w:color="BCCBDA"/>
+          <w:right w:val="single" w:sz="5" w:color="BCCBDA"/>
+          <w:insideH w:val="single" w:sz="5" w:color="BCCBDA"/>
+          <w:insideV w:val="single" w:sz="5" w:color="BCCBDA"/>
+        </w:tblBorders>
+      </w:tblPr>
+      <w:tblGrid>
+        <w:gridCol w:w="4153"/>
+        <w:gridCol w:w="4153"/>
+      </w:tblGrid>
+      <w:tr>
+        <w:trPr>
+          <w:tblHeader w:val="true"/>
+          <w:cantSplit/>
+        </w:trPr>
+        <w:tc>
+          <w:tcPr>
+            <w:tcW w:type="dxa" w:w="2381"/>
+            <w:shd w:fill="E7EFF8"/>
+            <w:vAlign w:val="center"/>
+            <w:tcMar>
+              <w:top w:w="100" w:type="dxa"/>
+              <w:start w:w="120" w:type="dxa"/>
+              <w:bottom w:w="100" w:type="dxa"/>
+              <w:end w:w="120" w:type="dxa"/>
+            </w:tcMar>
+          </w:tcPr>
+          <w:p>
+            <w:pPr>
+              <w:spacing w:after="0" w:before="0"/>
+              <w:jc w:val="left"/>
+            </w:pPr>
+            <w:r/>
+            <w:r>
+              <w:rPr>
+                <w:rFonts w:ascii="Arial" w:hAnsi="Arial" w:eastAsia="等线"/>
+                <w:b/>
+                <w:color w:val="1F4E79"/>
+                <w:sz w:val="18"/>
+              </w:rPr>
+              <w:t>Parent Class</w:t>
+            </w:r>
+          </w:p>
+        </w:tc>
+        <w:tc>
+          <w:tcPr>
+            <w:tcW w:type="dxa" w:w="5896"/>
+            <w:shd w:fill="E7EFF8"/>
+            <w:vAlign w:val="center"/>
+            <w:tcMar>
+              <w:top w:w="100" w:type="dxa"/>
+              <w:start w:w="120" w:type="dxa"/>
+              <w:bottom w:w="100" w:type="dxa"/>
+              <w:end w:w="120" w:type="dxa"/>
+            </w:tcMar>
+          </w:tcPr>
+          <w:p>
+            <w:pPr>
+              <w:spacing w:after="0" w:before="0"/>
+              <w:jc w:val="left"/>
+            </w:pPr>
+            <w:r/>
+            <w:r>
+              <w:rPr>
+                <w:rFonts w:ascii="Arial" w:hAnsi="Arial" w:eastAsia="等线"/>
+                <w:b/>
+                <w:color w:val="1F4E79"/>
+                <w:sz w:val="18"/>
+              </w:rPr>
+              <w:t>依赖定位节点</w:t>
+            </w:r>
+          </w:p>
+        </w:tc>
+      </w:tr>
+      <w:tr>
+        <w:trPr>
+          <w:cantSplit/>
+        </w:trPr>
+        <w:tc>
+          <w:tcPr>
+            <w:tcW w:type="dxa" w:w="2381"/>
+            <w:vAlign w:val="center"/>
+            <w:tcMar>
+              <w:top w:w="100" w:type="dxa"/>
+              <w:start w:w="120" w:type="dxa"/>
+              <w:bottom w:w="100" w:type="dxa"/>
+              <w:end w:w="120" w:type="dxa"/>
+            </w:tcMar>
+          </w:tcPr>
+          <w:p>
+            <w:pPr>
+              <w:spacing w:after="0" w:before="0"/>
+              <w:jc w:val="left"/>
+            </w:pPr>
+            <w:r/>
+            <w:r>
+              <w:rPr>
+                <w:rFonts w:ascii="Arial" w:hAnsi="Arial" w:eastAsia="等线"/>
+                <w:b w:val="0"/>
+                <w:color w:val="5F6B7A"/>
+                <w:sz w:val="16"/>
+              </w:rPr>
+              <w:t>[DependencyParentClass]</w:t>
+            </w:r>
+          </w:p>
+        </w:tc>
+        <w:tc>
+          <w:tcPr>
+            <w:tcW w:type="dxa" w:w="5896"/>
+            <w:vAlign w:val="center"/>
+            <w:tcMar>
+              <w:top w:w="100" w:type="dxa"/>
+              <w:start w:w="120" w:type="dxa"/>
+              <w:bottom w:w="100" w:type="dxa"/>
+              <w:end w:w="120" w:type="dxa"/>
+            </w:tcMar>
+          </w:tcPr>
+          <w:p>
+            <w:pPr>
+              <w:spacing w:after="0" w:before="0"/>
+              <w:jc w:val="left"/>
+            </w:pPr>
+            <w:r/>
+            <w:r>
+              <w:rPr>
+                <w:rFonts w:ascii="Arial" w:hAnsi="Arial" w:eastAsia="等线"/>
+                <w:b w:val="0"/>
+                <w:color w:val="5F6B7A"/>
+                <w:sz w:val="16"/>
+              </w:rPr>
+              <w:t>[DependencyLocatorNodes]</w:t>
+            </w:r>
+          </w:p>
+        </w:tc>
+      </w:tr>
+    </w:tbl>
+    <w:p>
+      <w:pPr>
+        <w:spacing w:after="0"/>
+      </w:pPr>
+    </w:p>
+    <w:p>
+      <w:pPr>
+        <w:pStyle w:val="ToolSection"/>
+      </w:pPr>
+      <w:r>
+        <w:t>3. 构建偏差</w:t>
       </w:r>
     </w:p>
     <w:p>
@@ -1553,7 +2548,7 @@
         <w:pStyle w:val="ToolSection"/>
       </w:pPr>
       <w:r>
-        <w:t>7. 状态控制待接入项</w:t>
+        <w:t>4. 状态控制待接入项</w:t>
       </w:r>
     </w:p>
     <w:p>
@@ -1716,77 +2711,6 @@
         <w:spacing w:after="0"/>
       </w:pPr>
     </w:p>
-    <w:p>
-      <w:r>
-        <w:br w:type="page"/>
-      </w:r>
-    </w:p>
-    <w:p>
-      <w:pPr>
-        <w:pStyle w:val="ToolSection"/>
-      </w:pPr>
-      <w:r>
-        <w:t>附录 A · 机器可追溯语义关系</w:t>
-      </w:r>
-    </w:p>
-    <w:p>
-      <w:pPr>
-        <w:pStyle w:val="TemplateNote"/>
-        <w:keepNext/>
-      </w:pPr>
-      <w:r>
-        <w:t>将机器生成的语义关系句逐条原样写入；不得改写、拼接或遗漏。</w:t>
-      </w:r>
-    </w:p>
-    <w:tbl>
-      <w:tblPr>
-        <w:tblW w:type="auto" w:w="0"/>
-        <w:jc w:val="center"/>
-        <w:tblLayout w:type="fixed"/>
-        <w:tblLook w:firstColumn="1" w:firstRow="1" w:lastColumn="0" w:lastRow="0" w:noHBand="0" w:noVBand="1" w:val="04A0"/>
-      </w:tblPr>
-      <w:tblGrid>
-        <w:gridCol w:w="8306"/>
-      </w:tblGrid>
-      <w:tr>
-        <w:trPr>
-          <w:cantSplit/>
-        </w:trPr>
-        <w:tc>
-          <w:tcPr>
-            <w:tcW w:type="dxa" w:w="8306"/>
-            <w:shd w:fill="F1F4F8"/>
-            <w:tcMar>
-              <w:top w:w="140" w:type="dxa"/>
-              <w:start w:w="160" w:type="dxa"/>
-              <w:bottom w:w="140" w:type="dxa"/>
-              <w:end w:w="160" w:type="dxa"/>
-            </w:tcMar>
-          </w:tcPr>
-          <w:p>
-            <w:pPr>
-              <w:keepLines/>
-              <w:spacing w:after="0"/>
-              <w:jc w:val="left"/>
-            </w:pPr>
-            <w:r/>
-            <w:r>
-              <w:rPr>
-                <w:rFonts w:ascii="Consolas" w:hAnsi="Consolas" w:eastAsia="等线"/>
-                <w:color w:val="5F6B7A"/>
-                <w:sz w:val="16"/>
-              </w:rPr>
-              <w:t>[ExactSemanticRelationshipStatement]</w:t>
-            </w:r>
-          </w:p>
-        </w:tc>
-      </w:tr>
-    </w:tbl>
-    <w:p>
-      <w:pPr>
-        <w:spacing w:after="0"/>
-      </w:pPr>
-    </w:p>
     <w:sectPr>
       <w:headerReference w:type="default" r:id="rId9"/>
       <w:footerReference w:type="default" r:id="rId10"/>
@@ -13930,19 +14854,6 @@
       <w:b/>
       <w:color w:val="2E75B6"/>
       <w:sz w:val="26"/>
-    </w:rPr>
-  </w:style>
-  <w:style w:type="paragraph" w:customStyle="1" w:styleId="ProgramTrace">
-    <w:name w:val="Program Trace"/>
-    <w:basedOn w:val="Normal"/>
-    <w:pPr>
-      <w:spacing w:before="0" w:after="40" w:line="240" w:lineRule="auto"/>
-      <w:jc w:val="left"/>
-    </w:pPr>
-    <w:rPr>
-      <w:rFonts w:ascii="Consolas" w:hAnsi="Consolas" w:eastAsia="等线"/>
-      <w:color w:val="202833"/>
-      <w:sz w:val="14"/>
     </w:rPr>
   </w:style>
   <w:style w:type="paragraph" w:customStyle="1" w:styleId="TreeCaption">

</xml_diff>